<commit_message>
Expand final report layout for readability
</commit_message>
<xml_diff>
--- a/report/RAG_Retrieval_Reranking_Report.docx
+++ b/report/RAG_Retrieval_Reranking_Report.docx
@@ -81,10 +81,10 @@
         <w:tblLook w:firstColumn="1" w:firstRow="1" w:lastColumn="0" w:lastRow="0" w:noHBand="0" w:noVBand="1" w:val="04A0"/>
       </w:tblPr>
       <w:tblGrid>
-        <w:gridCol w:w="2570"/>
-        <w:gridCol w:w="2570"/>
-        <w:gridCol w:w="2570"/>
-        <w:gridCol w:w="2570"/>
+        <w:gridCol w:w="2498"/>
+        <w:gridCol w:w="2498"/>
+        <w:gridCol w:w="2498"/>
+        <w:gridCol w:w="2498"/>
       </w:tblGrid>
       <w:tr>
         <w:trPr>
@@ -93,13 +93,13 @@
         </w:trPr>
         <w:tc>
           <w:tcPr>
-            <w:tcW w:type="dxa" w:w="3341"/>
+            <w:tcW w:type="dxa" w:w="3168"/>
             <w:vAlign w:val="center"/>
             <w:tcMar>
-              <w:top w:w="65" w:type="dxa"/>
-              <w:start w:w="75" w:type="dxa"/>
-              <w:bottom w:w="65" w:type="dxa"/>
-              <w:end w:w="75" w:type="dxa"/>
+              <w:top w:w="85" w:type="dxa"/>
+              <w:start w:w="85" w:type="dxa"/>
+              <w:bottom w:w="85" w:type="dxa"/>
+              <w:end w:w="85" w:type="dxa"/>
             </w:tcMar>
             <w:shd w:fill="17324D"/>
           </w:tcPr>
@@ -127,13 +127,13 @@
         </w:tc>
         <w:tc>
           <w:tcPr>
-            <w:tcW w:type="dxa" w:w="1584"/>
+            <w:tcW w:type="dxa" w:w="1440"/>
             <w:vAlign w:val="center"/>
             <w:tcMar>
-              <w:top w:w="65" w:type="dxa"/>
-              <w:start w:w="75" w:type="dxa"/>
-              <w:bottom w:w="65" w:type="dxa"/>
-              <w:end w:w="75" w:type="dxa"/>
+              <w:top w:w="85" w:type="dxa"/>
+              <w:start w:w="85" w:type="dxa"/>
+              <w:bottom w:w="85" w:type="dxa"/>
+              <w:end w:w="85" w:type="dxa"/>
             </w:tcMar>
             <w:shd w:fill="17324D"/>
           </w:tcPr>
@@ -161,13 +161,13 @@
         </w:tc>
         <w:tc>
           <w:tcPr>
-            <w:tcW w:type="dxa" w:w="1944"/>
+            <w:tcW w:type="dxa" w:w="1584"/>
             <w:vAlign w:val="center"/>
             <w:tcMar>
-              <w:top w:w="65" w:type="dxa"/>
-              <w:start w:w="75" w:type="dxa"/>
-              <w:bottom w:w="65" w:type="dxa"/>
-              <w:end w:w="75" w:type="dxa"/>
+              <w:top w:w="85" w:type="dxa"/>
+              <w:start w:w="85" w:type="dxa"/>
+              <w:bottom w:w="85" w:type="dxa"/>
+              <w:end w:w="85" w:type="dxa"/>
             </w:tcMar>
             <w:shd w:fill="17324D"/>
           </w:tcPr>
@@ -197,13 +197,13 @@
         </w:tc>
         <w:tc>
           <w:tcPr>
-            <w:tcW w:type="dxa" w:w="3571"/>
+            <w:tcW w:type="dxa" w:w="4104"/>
             <w:vAlign w:val="center"/>
             <w:tcMar>
-              <w:top w:w="65" w:type="dxa"/>
-              <w:start w:w="75" w:type="dxa"/>
-              <w:bottom w:w="65" w:type="dxa"/>
-              <w:end w:w="75" w:type="dxa"/>
+              <w:top w:w="85" w:type="dxa"/>
+              <w:start w:w="85" w:type="dxa"/>
+              <w:bottom w:w="85" w:type="dxa"/>
+              <w:end w:w="85" w:type="dxa"/>
             </w:tcMar>
             <w:shd w:fill="17324D"/>
           </w:tcPr>
@@ -238,14 +238,14 @@
         </w:trPr>
         <w:tc>
           <w:tcPr>
-            <w:tcW w:type="dxa" w:w="3341"/>
+            <w:tcW w:type="dxa" w:w="3168"/>
             <w:vAlign w:val="center"/>
             <w:shd w:fill="EEF4F7"/>
             <w:tcMar>
-              <w:top w:w="65" w:type="dxa"/>
-              <w:start w:w="75" w:type="dxa"/>
-              <w:bottom w:w="65" w:type="dxa"/>
-              <w:end w:w="75" w:type="dxa"/>
+              <w:top w:w="85" w:type="dxa"/>
+              <w:start w:w="85" w:type="dxa"/>
+              <w:bottom w:w="85" w:type="dxa"/>
+              <w:end w:w="85" w:type="dxa"/>
             </w:tcMar>
           </w:tcPr>
           <w:p>
@@ -258,7 +258,7 @@
                 <w:rFonts w:ascii="Aptos" w:hAnsi="Aptos"/>
                 <w:b w:val="0"/>
                 <w:color w:val="26313D"/>
-                <w:sz w:val="16"/>
+                <w:sz w:val="18"/>
               </w:rPr>
               <w:t>F1  Keyword trap / specific rule</w:t>
               <w:br/>
@@ -268,13 +268,13 @@
         </w:tc>
         <w:tc>
           <w:tcPr>
-            <w:tcW w:type="dxa" w:w="1584"/>
+            <w:tcW w:type="dxa" w:w="1440"/>
             <w:vAlign w:val="center"/>
             <w:tcMar>
-              <w:top w:w="65" w:type="dxa"/>
-              <w:start w:w="75" w:type="dxa"/>
-              <w:bottom w:w="65" w:type="dxa"/>
-              <w:end w:w="75" w:type="dxa"/>
+              <w:top w:w="85" w:type="dxa"/>
+              <w:start w:w="85" w:type="dxa"/>
+              <w:bottom w:w="85" w:type="dxa"/>
+              <w:end w:w="85" w:type="dxa"/>
             </w:tcMar>
           </w:tcPr>
           <w:p>
@@ -287,7 +287,7 @@
                 <w:rFonts w:ascii="Aptos" w:hAnsi="Aptos"/>
                 <w:b w:val="0"/>
                 <w:color w:val="26313D"/>
-                <w:sz w:val="16"/>
+                <w:sz w:val="18"/>
               </w:rPr>
               <w:t>C0129, p. 49</w:t>
               <w:br/>
@@ -297,13 +297,13 @@
         </w:tc>
         <w:tc>
           <w:tcPr>
-            <w:tcW w:type="dxa" w:w="1944"/>
+            <w:tcW w:type="dxa" w:w="1584"/>
             <w:vAlign w:val="center"/>
             <w:tcMar>
-              <w:top w:w="65" w:type="dxa"/>
-              <w:start w:w="75" w:type="dxa"/>
-              <w:bottom w:w="65" w:type="dxa"/>
-              <w:end w:w="75" w:type="dxa"/>
+              <w:top w:w="85" w:type="dxa"/>
+              <w:start w:w="85" w:type="dxa"/>
+              <w:bottom w:w="85" w:type="dxa"/>
+              <w:end w:w="85" w:type="dxa"/>
             </w:tcMar>
           </w:tcPr>
           <w:p>
@@ -316,7 +316,7 @@
                 <w:rFonts w:ascii="Aptos" w:hAnsi="Aptos"/>
                 <w:b w:val="0"/>
                 <w:color w:val="26313D"/>
-                <w:sz w:val="16"/>
+                <w:sz w:val="18"/>
               </w:rPr>
               <w:t>“Insufficient context”</w:t>
             </w:r>
@@ -324,13 +324,13 @@
         </w:tc>
         <w:tc>
           <w:tcPr>
-            <w:tcW w:type="dxa" w:w="3571"/>
+            <w:tcW w:type="dxa" w:w="4104"/>
             <w:vAlign w:val="center"/>
             <w:tcMar>
-              <w:top w:w="65" w:type="dxa"/>
-              <w:start w:w="75" w:type="dxa"/>
-              <w:bottom w:w="65" w:type="dxa"/>
-              <w:end w:w="75" w:type="dxa"/>
+              <w:top w:w="85" w:type="dxa"/>
+              <w:start w:w="85" w:type="dxa"/>
+              <w:bottom w:w="85" w:type="dxa"/>
+              <w:end w:w="85" w:type="dxa"/>
             </w:tcMar>
           </w:tcPr>
           <w:p>
@@ -343,7 +343,7 @@
                 <w:rFonts w:ascii="Aptos" w:hAnsi="Aptos"/>
                 <w:b w:val="0"/>
                 <w:color w:val="26313D"/>
-                <w:sz w:val="16"/>
+                <w:sz w:val="18"/>
               </w:rPr>
               <w:t>“The authenticator or verifier SHALL implement a retry-limiting mechanism that limits the number of consecutive failed activation attempts using the authenticator to no more than 10.”</w:t>
             </w:r>
@@ -356,14 +356,14 @@
         </w:trPr>
         <w:tc>
           <w:tcPr>
-            <w:tcW w:type="dxa" w:w="3341"/>
+            <w:tcW w:type="dxa" w:w="3168"/>
             <w:vAlign w:val="center"/>
             <w:shd w:fill="EEF4F7"/>
             <w:tcMar>
-              <w:top w:w="65" w:type="dxa"/>
-              <w:start w:w="75" w:type="dxa"/>
-              <w:bottom w:w="65" w:type="dxa"/>
-              <w:end w:w="75" w:type="dxa"/>
+              <w:top w:w="85" w:type="dxa"/>
+              <w:start w:w="85" w:type="dxa"/>
+              <w:bottom w:w="85" w:type="dxa"/>
+              <w:end w:w="85" w:type="dxa"/>
             </w:tcMar>
           </w:tcPr>
           <w:p>
@@ -376,7 +376,7 @@
                 <w:rFonts w:ascii="Aptos" w:hAnsi="Aptos"/>
                 <w:b w:val="0"/>
                 <w:color w:val="26313D"/>
-                <w:sz w:val="16"/>
+                <w:sz w:val="18"/>
               </w:rPr>
               <w:t>F2  Negation / modality constraint</w:t>
               <w:br/>
@@ -386,13 +386,13 @@
         </w:tc>
         <w:tc>
           <w:tcPr>
-            <w:tcW w:type="dxa" w:w="1584"/>
+            <w:tcW w:type="dxa" w:w="1440"/>
             <w:vAlign w:val="center"/>
             <w:tcMar>
-              <w:top w:w="65" w:type="dxa"/>
-              <w:start w:w="75" w:type="dxa"/>
-              <w:bottom w:w="65" w:type="dxa"/>
-              <w:end w:w="75" w:type="dxa"/>
+              <w:top w:w="85" w:type="dxa"/>
+              <w:start w:w="85" w:type="dxa"/>
+              <w:bottom w:w="85" w:type="dxa"/>
+              <w:end w:w="85" w:type="dxa"/>
             </w:tcMar>
           </w:tcPr>
           <w:p>
@@ -405,7 +405,7 @@
                 <w:rFonts w:ascii="Aptos" w:hAnsi="Aptos"/>
                 <w:b w:val="0"/>
                 <w:color w:val="26313D"/>
-                <w:sz w:val="16"/>
+                <w:sz w:val="18"/>
               </w:rPr>
               <w:t>C0113, pp. 43–44</w:t>
               <w:br/>
@@ -415,13 +415,13 @@
         </w:tc>
         <w:tc>
           <w:tcPr>
-            <w:tcW w:type="dxa" w:w="1944"/>
+            <w:tcW w:type="dxa" w:w="1584"/>
             <w:vAlign w:val="center"/>
             <w:tcMar>
-              <w:top w:w="65" w:type="dxa"/>
-              <w:start w:w="75" w:type="dxa"/>
-              <w:bottom w:w="65" w:type="dxa"/>
-              <w:end w:w="75" w:type="dxa"/>
+              <w:top w:w="85" w:type="dxa"/>
+              <w:start w:w="85" w:type="dxa"/>
+              <w:bottom w:w="85" w:type="dxa"/>
+              <w:end w:w="85" w:type="dxa"/>
             </w:tcMar>
           </w:tcPr>
           <w:p>
@@ -434,7 +434,7 @@
                 <w:rFonts w:ascii="Aptos" w:hAnsi="Aptos"/>
                 <w:b w:val="0"/>
                 <w:color w:val="26313D"/>
-                <w:sz w:val="16"/>
+                <w:sz w:val="18"/>
               </w:rPr>
               <w:t>“Insufficient context”</w:t>
             </w:r>
@@ -442,13 +442,13 @@
         </w:tc>
         <w:tc>
           <w:tcPr>
-            <w:tcW w:type="dxa" w:w="3571"/>
+            <w:tcW w:type="dxa" w:w="4104"/>
             <w:vAlign w:val="center"/>
             <w:tcMar>
-              <w:top w:w="65" w:type="dxa"/>
-              <w:start w:w="75" w:type="dxa"/>
-              <w:bottom w:w="65" w:type="dxa"/>
-              <w:end w:w="75" w:type="dxa"/>
+              <w:top w:w="85" w:type="dxa"/>
+              <w:start w:w="85" w:type="dxa"/>
+              <w:bottom w:w="85" w:type="dxa"/>
+              <w:end w:w="85" w:type="dxa"/>
             </w:tcMar>
           </w:tcPr>
           <w:p>
@@ -461,7 +461,7 @@
                 <w:rFonts w:ascii="Aptos" w:hAnsi="Aptos"/>
                 <w:b w:val="0"/>
                 <w:color w:val="26313D"/>
-                <w:sz w:val="16"/>
+                <w:sz w:val="18"/>
               </w:rPr>
               <w:t>“Biometric comparison based on voice SHALL NOT be used.”</w:t>
             </w:r>
@@ -469,6 +469,14 @@
         </w:tc>
       </w:tr>
     </w:tbl>
+    <w:p>
+      <w:pPr>
+        <w:pStyle w:val="Heading2"/>
+      </w:pPr>
+      <w:r>
+        <w:t>What the rank shifts show</w:t>
+      </w:r>
+    </w:p>
     <w:p>
       <w:pPr>
         <w:spacing w:before="100"/>
@@ -484,15 +492,22 @@
       </w:r>
     </w:p>
     <w:p>
+      <w:r>
+        <w:br w:type="page"/>
+      </w:r>
+    </w:p>
+    <w:p>
+      <w:pPr>
+        <w:pStyle w:val="Heading2"/>
+      </w:pPr>
+      <w:r>
+        <w:t>Retrieved distractors</w:t>
+      </w:r>
+    </w:p>
+    <w:p>
       <w:pPr>
         <w:spacing w:after="60"/>
       </w:pPr>
-      <w:r>
-        <w:rPr>
-          <w:b/>
-        </w:rPr>
-        <w:t xml:space="preserve">Retrieved distractors. </w:t>
-      </w:r>
       <w:r>
         <w:t>F1’s dense Top 3 contained C0249 (local verification and passwords), C0090 (a 64-bit OTP condition), and C0106 (the general 100-attempt throttling rule); the specific 10-attempt activation-secret limit is in C0129. F2’s Top 3 contained general biometric rationale, usability, and measurement passages (C0110, C0225, C0109); the explicit voice SHALL NOT clause is in C0113.</w:t>
       </w:r>
@@ -519,10 +534,10 @@
         <w:tblLook w:firstColumn="1" w:firstRow="1" w:lastColumn="0" w:lastRow="0" w:noHBand="0" w:noVBand="1" w:val="04A0"/>
       </w:tblPr>
       <w:tblGrid>
-        <w:gridCol w:w="2570"/>
-        <w:gridCol w:w="2570"/>
-        <w:gridCol w:w="2570"/>
-        <w:gridCol w:w="2570"/>
+        <w:gridCol w:w="2498"/>
+        <w:gridCol w:w="2498"/>
+        <w:gridCol w:w="2498"/>
+        <w:gridCol w:w="2498"/>
       </w:tblGrid>
       <w:tr>
         <w:trPr>
@@ -534,10 +549,10 @@
             <w:tcW w:type="dxa" w:w="1440"/>
             <w:vAlign w:val="center"/>
             <w:tcMar>
-              <w:top w:w="65" w:type="dxa"/>
-              <w:start w:w="75" w:type="dxa"/>
-              <w:bottom w:w="65" w:type="dxa"/>
-              <w:end w:w="75" w:type="dxa"/>
+              <w:top w:w="85" w:type="dxa"/>
+              <w:start w:w="85" w:type="dxa"/>
+              <w:bottom w:w="85" w:type="dxa"/>
+              <w:end w:w="85" w:type="dxa"/>
             </w:tcMar>
             <w:shd w:fill="17324D"/>
           </w:tcPr>
@@ -568,10 +583,10 @@
             <w:tcW w:type="dxa" w:w="2880"/>
             <w:vAlign w:val="center"/>
             <w:tcMar>
-              <w:top w:w="65" w:type="dxa"/>
-              <w:start w:w="75" w:type="dxa"/>
-              <w:bottom w:w="65" w:type="dxa"/>
-              <w:end w:w="75" w:type="dxa"/>
+              <w:top w:w="85" w:type="dxa"/>
+              <w:start w:w="85" w:type="dxa"/>
+              <w:bottom w:w="85" w:type="dxa"/>
+              <w:end w:w="85" w:type="dxa"/>
             </w:tcMar>
             <w:shd w:fill="17324D"/>
           </w:tcPr>
@@ -602,10 +617,10 @@
             <w:tcW w:type="dxa" w:w="2880"/>
             <w:vAlign w:val="center"/>
             <w:tcMar>
-              <w:top w:w="65" w:type="dxa"/>
-              <w:start w:w="75" w:type="dxa"/>
-              <w:bottom w:w="65" w:type="dxa"/>
-              <w:end w:w="75" w:type="dxa"/>
+              <w:top w:w="85" w:type="dxa"/>
+              <w:start w:w="85" w:type="dxa"/>
+              <w:bottom w:w="85" w:type="dxa"/>
+              <w:end w:w="85" w:type="dxa"/>
             </w:tcMar>
             <w:shd w:fill="17324D"/>
           </w:tcPr>
@@ -636,10 +651,10 @@
             <w:tcW w:type="dxa" w:w="3240"/>
             <w:vAlign w:val="center"/>
             <w:tcMar>
-              <w:top w:w="65" w:type="dxa"/>
-              <w:start w:w="75" w:type="dxa"/>
-              <w:bottom w:w="65" w:type="dxa"/>
-              <w:end w:w="75" w:type="dxa"/>
+              <w:top w:w="85" w:type="dxa"/>
+              <w:start w:w="85" w:type="dxa"/>
+              <w:bottom w:w="85" w:type="dxa"/>
+              <w:end w:w="85" w:type="dxa"/>
             </w:tcMar>
             <w:shd w:fill="17324D"/>
           </w:tcPr>
@@ -675,10 +690,10 @@
             <w:tcW w:type="dxa" w:w="1440"/>
             <w:vAlign w:val="center"/>
             <w:tcMar>
-              <w:top w:w="65" w:type="dxa"/>
-              <w:start w:w="75" w:type="dxa"/>
-              <w:bottom w:w="65" w:type="dxa"/>
-              <w:end w:w="75" w:type="dxa"/>
+              <w:top w:w="85" w:type="dxa"/>
+              <w:start w:w="85" w:type="dxa"/>
+              <w:bottom w:w="85" w:type="dxa"/>
+              <w:end w:w="85" w:type="dxa"/>
             </w:tcMar>
           </w:tcPr>
           <w:p>
@@ -702,10 +717,10 @@
             <w:tcW w:type="dxa" w:w="2880"/>
             <w:vAlign w:val="center"/>
             <w:tcMar>
-              <w:top w:w="65" w:type="dxa"/>
-              <w:start w:w="75" w:type="dxa"/>
-              <w:bottom w:w="65" w:type="dxa"/>
-              <w:end w:w="75" w:type="dxa"/>
+              <w:top w:w="85" w:type="dxa"/>
+              <w:start w:w="85" w:type="dxa"/>
+              <w:bottom w:w="85" w:type="dxa"/>
+              <w:end w:w="85" w:type="dxa"/>
             </w:tcMar>
           </w:tcPr>
           <w:p>
@@ -729,10 +744,10 @@
             <w:tcW w:type="dxa" w:w="2880"/>
             <w:vAlign w:val="center"/>
             <w:tcMar>
-              <w:top w:w="65" w:type="dxa"/>
-              <w:start w:w="75" w:type="dxa"/>
-              <w:bottom w:w="65" w:type="dxa"/>
-              <w:end w:w="75" w:type="dxa"/>
+              <w:top w:w="85" w:type="dxa"/>
+              <w:start w:w="85" w:type="dxa"/>
+              <w:bottom w:w="85" w:type="dxa"/>
+              <w:end w:w="85" w:type="dxa"/>
             </w:tcMar>
           </w:tcPr>
           <w:p>
@@ -756,10 +771,10 @@
             <w:tcW w:type="dxa" w:w="3240"/>
             <w:vAlign w:val="center"/>
             <w:tcMar>
-              <w:top w:w="65" w:type="dxa"/>
-              <w:start w:w="75" w:type="dxa"/>
-              <w:bottom w:w="65" w:type="dxa"/>
-              <w:end w:w="75" w:type="dxa"/>
+              <w:top w:w="85" w:type="dxa"/>
+              <w:start w:w="85" w:type="dxa"/>
+              <w:bottom w:w="85" w:type="dxa"/>
+              <w:end w:w="85" w:type="dxa"/>
             </w:tcMar>
           </w:tcPr>
           <w:p>
@@ -788,10 +803,10 @@
             <w:tcW w:type="dxa" w:w="1440"/>
             <w:vAlign w:val="center"/>
             <w:tcMar>
-              <w:top w:w="65" w:type="dxa"/>
-              <w:start w:w="75" w:type="dxa"/>
-              <w:bottom w:w="65" w:type="dxa"/>
-              <w:end w:w="75" w:type="dxa"/>
+              <w:top w:w="85" w:type="dxa"/>
+              <w:start w:w="85" w:type="dxa"/>
+              <w:bottom w:w="85" w:type="dxa"/>
+              <w:end w:w="85" w:type="dxa"/>
             </w:tcMar>
           </w:tcPr>
           <w:p>
@@ -815,10 +830,10 @@
             <w:tcW w:type="dxa" w:w="2880"/>
             <w:vAlign w:val="center"/>
             <w:tcMar>
-              <w:top w:w="65" w:type="dxa"/>
-              <w:start w:w="75" w:type="dxa"/>
-              <w:bottom w:w="65" w:type="dxa"/>
-              <w:end w:w="75" w:type="dxa"/>
+              <w:top w:w="85" w:type="dxa"/>
+              <w:start w:w="85" w:type="dxa"/>
+              <w:bottom w:w="85" w:type="dxa"/>
+              <w:end w:w="85" w:type="dxa"/>
             </w:tcMar>
           </w:tcPr>
           <w:p>
@@ -842,10 +857,10 @@
             <w:tcW w:type="dxa" w:w="2880"/>
             <w:vAlign w:val="center"/>
             <w:tcMar>
-              <w:top w:w="65" w:type="dxa"/>
-              <w:start w:w="75" w:type="dxa"/>
-              <w:bottom w:w="65" w:type="dxa"/>
-              <w:end w:w="75" w:type="dxa"/>
+              <w:top w:w="85" w:type="dxa"/>
+              <w:start w:w="85" w:type="dxa"/>
+              <w:bottom w:w="85" w:type="dxa"/>
+              <w:end w:w="85" w:type="dxa"/>
             </w:tcMar>
           </w:tcPr>
           <w:p>
@@ -869,10 +884,10 @@
             <w:tcW w:type="dxa" w:w="3240"/>
             <w:vAlign w:val="center"/>
             <w:tcMar>
-              <w:top w:w="65" w:type="dxa"/>
-              <w:start w:w="75" w:type="dxa"/>
-              <w:bottom w:w="65" w:type="dxa"/>
-              <w:end w:w="75" w:type="dxa"/>
+              <w:top w:w="85" w:type="dxa"/>
+              <w:start w:w="85" w:type="dxa"/>
+              <w:bottom w:w="85" w:type="dxa"/>
+              <w:end w:w="85" w:type="dxa"/>
             </w:tcMar>
           </w:tcPr>
           <w:p>
@@ -895,7 +910,7 @@
     </w:tbl>
     <w:p>
       <w:r>
-        <w:t>Reranking adds measurable CPU latency, but improves the position of the critical passages. Timings vary with hardware and system load.</w:t>
+        <w:t>Reranking adds about 216–268 ms for ten candidates in these trials, lifting total retrieval from about 12 ms to 231–281 ms. Timings vary with hardware and system load; the relevance gains are documented in the two cases on page 1.</w:t>
       </w:r>
     </w:p>
     <w:p>
@@ -908,7 +923,7 @@
     </w:p>
     <w:p>
       <w:r>
-        <w:t>A cross-encoder must run joint attention separately for every query-passage pair. With 307 chunks, scoring the whole document would require 307 pairwise inferences for each query. The bi-encoder instead precomputes passage vectors and cheaply narrows the collection; reranking only the ten strongest candidates concentrates the expensive comparison where it is most useful.</w:t>
+        <w:t>A cross-encoder must run joint attention separately for every query-passage pair. Scoring all 307 chunks would require 307 pairwise inferences per query, about 31 times the ten-passage reranking stage used here. The bi-encoder precomputes passage vectors and cheaply narrows the collection first; the cross-encoder then spends its higher per-pair cost on the strongest candidates, where finer token-level comparison can correct ranking errors.</w:t>
       </w:r>
     </w:p>
     <w:p>
@@ -934,7 +949,7 @@
     </w:p>
     <w:sectPr>
       <w:pgSz w:w="12240" w:h="15840"/>
-      <w:pgMar w:top="835" w:right="979" w:bottom="835" w:left="979" w:header="720" w:footer="720" w:gutter="0"/>
+      <w:pgMar w:top="1037" w:right="1123" w:bottom="1037" w:left="1123" w:header="720" w:footer="720" w:gutter="0"/>
       <w:cols w:space="720"/>
       <w:docGrid w:linePitch="360"/>
     </w:sectPr>
@@ -1306,12 +1321,12 @@
     <w:qFormat/>
     <w:rsid w:val="00FC693F"/>
     <w:pPr>
-      <w:spacing w:after="80" w:line="254" w:lineRule="auto"/>
+      <w:spacing w:after="120" w:line="264" w:lineRule="auto"/>
     </w:pPr>
     <w:rPr>
       <w:rFonts w:ascii="Aptos" w:hAnsi="Aptos"/>
       <w:color w:val="26313D"/>
-      <w:sz w:val="19"/>
+      <w:sz w:val="21"/>
     </w:rPr>
   </w:style>
   <w:style w:type="paragraph" w:styleId="Header">
@@ -1369,7 +1384,7 @@
     <w:pPr>
       <w:keepNext/>
       <w:keepLines/>
-      <w:spacing w:before="180" w:after="80"/>
+      <w:spacing w:before="240" w:after="120"/>
       <w:outlineLvl w:val="0"/>
     </w:pPr>
     <w:rPr>
@@ -1377,7 +1392,7 @@
       <w:b/>
       <w:bCs/>
       <w:color w:val="17324D"/>
-      <w:sz w:val="28"/>
+      <w:sz w:val="32"/>
       <w:szCs w:val="28"/>
     </w:rPr>
   </w:style>
@@ -1393,7 +1408,7 @@
     <w:pPr>
       <w:keepNext/>
       <w:keepLines/>
-      <w:spacing w:before="180" w:after="80"/>
+      <w:spacing w:before="240" w:after="120"/>
       <w:outlineLvl w:val="1"/>
     </w:pPr>
     <w:rPr>
@@ -1401,7 +1416,7 @@
       <w:b/>
       <w:bCs/>
       <w:color w:val="087E8B"/>
-      <w:sz w:val="22"/>
+      <w:sz w:val="24"/>
       <w:szCs w:val="26"/>
     </w:rPr>
   </w:style>
@@ -1655,7 +1670,7 @@
     <w:qFormat/>
     <w:rsid w:val="00FC693F"/>
     <w:pPr>
-      <w:spacing w:after="80" w:line="240" w:lineRule="auto" w:before="0"/>
+      <w:spacing w:after="120" w:line="240" w:lineRule="auto" w:before="0"/>
       <w:contextualSpacing/>
     </w:pPr>
     <w:rPr>
@@ -1664,7 +1679,7 @@
       <w:color w:val="17324D"/>
       <w:spacing w:val="5"/>
       <w:kern w:val="28"/>
-      <w:sz w:val="44"/>
+      <w:sz w:val="48"/>
       <w:szCs w:val="52"/>
     </w:rPr>
   </w:style>

</xml_diff>

<commit_message>
Document experiment environment in final report
</commit_message>
<xml_diff>
--- a/report/RAG_Retrieval_Reranking_Report.docx
+++ b/report/RAG_Retrieval_Reranking_Report.docx
@@ -928,14 +928,77 @@
     </w:p>
     <w:p>
       <w:pPr>
-        <w:spacing w:before="100" w:after="0"/>
+        <w:pStyle w:val="Heading1"/>
+      </w:pPr>
+      <w:r>
+        <w:t>Experiment environment</w:t>
+      </w:r>
+    </w:p>
+    <w:p>
+      <w:pPr>
+        <w:spacing w:after="60"/>
       </w:pPr>
       <w:r>
         <w:rPr>
-          <w:color w:val="5A6670"/>
-          <w:sz w:val="15"/>
+          <w:b/>
         </w:rPr>
-        <w:t xml:space="preserve">NIST SP 800-63B-4 (July 2025); 307 chunks; all-MiniLM-L6-v2 bi-encoder; ms-marco-MiniLM-L-6-v2 cross-encoder; Gemini 3.5 Flash-Lite. https://doi.org/10.6028/NIST.SP.800-63B-4. Notebook: </w:t>
+        <w:t xml:space="preserve">Document: </w:t>
+      </w:r>
+      <w:r>
+        <w:t>NIST SP 800-63B-4, Digital Identity Guidelines: Authentication and Authenticator Management (July 2025); 129 pages.</w:t>
+      </w:r>
+    </w:p>
+    <w:p>
+      <w:pPr>
+        <w:spacing w:after="60"/>
+      </w:pPr>
+      <w:r>
+        <w:rPr>
+          <w:b/>
+        </w:rPr>
+        <w:t xml:space="preserve">Corpus: </w:t>
+      </w:r>
+      <w:r>
+        <w:t>307 chunks, with 180 words per chunk and 40-word overlap.</w:t>
+      </w:r>
+    </w:p>
+    <w:p>
+      <w:pPr>
+        <w:spacing w:after="60"/>
+      </w:pPr>
+      <w:r>
+        <w:rPr>
+          <w:b/>
+        </w:rPr>
+        <w:t xml:space="preserve">Generator: </w:t>
+      </w:r>
+      <w:r>
+        <w:t>Gemini 3.5 Flash-Lite via the Gemini API, used for both baseline and reranked answers.</w:t>
+      </w:r>
+    </w:p>
+    <w:p>
+      <w:pPr>
+        <w:spacing w:after="60"/>
+      </w:pPr>
+      <w:r>
+        <w:rPr>
+          <w:b/>
+        </w:rPr>
+        <w:t xml:space="preserve">Retrieval models: </w:t>
+      </w:r>
+      <w:r>
+        <w:t>sentence-transformers/all-MiniLM-L6-v2 bi-encoder; cross-encoder/ms-marco-MiniLM-L-6-v2 cross-encoder.</w:t>
+      </w:r>
+    </w:p>
+    <w:p>
+      <w:pPr>
+        <w:spacing w:after="0"/>
+      </w:pPr>
+      <w:r>
+        <w:rPr>
+          <w:b/>
+        </w:rPr>
+        <w:t xml:space="preserve">Notebook: </w:t>
       </w:r>
       <w:hyperlink r:id="rId9">
         <w:r>
@@ -943,9 +1006,12 @@
             <w:color w:val="087E8B"/>
             <w:u w:val="single"/>
           </w:rPr>
-          <w:t>open notebook on GitHub</w:t>
+          <w:t>Open the Jupyter notebook on GitHub</w:t>
         </w:r>
       </w:hyperlink>
+      <w:r>
+        <w:t xml:space="preserve">  |  NIST source: https://doi.org/10.6028/NIST.SP.800-63B-4</w:t>
+      </w:r>
     </w:p>
     <w:sectPr>
       <w:pgSz w:w="12240" w:h="15840"/>

</xml_diff>

<commit_message>
Move experiment environment to report opening
</commit_message>
<xml_diff>
--- a/report/RAG_Retrieval_Reranking_Report.docx
+++ b/report/RAG_Retrieval_Reranking_Report.docx
@@ -27,6 +27,93 @@
     <w:p>
       <w:r>
         <w:t>A bi-encoder quickly retrieves candidate passages, while a cross-encoder reranks the strongest candidates. In two document-specific stress cases, reranking moved the answer-bearing chunk to rank 1 and enabled Gemini Flash-Lite to answer where the baseline abstained.</w:t>
+      </w:r>
+    </w:p>
+    <w:p>
+      <w:pPr>
+        <w:pStyle w:val="Heading1"/>
+      </w:pPr>
+      <w:r>
+        <w:t>Experiment environment</w:t>
+      </w:r>
+    </w:p>
+    <w:p>
+      <w:pPr>
+        <w:spacing w:after="60"/>
+      </w:pPr>
+      <w:r>
+        <w:rPr>
+          <w:b/>
+        </w:rPr>
+        <w:t xml:space="preserve">Document: </w:t>
+      </w:r>
+      <w:r>
+        <w:t>NIST SP 800-63B-4, Digital Identity Guidelines: Authentication and Authenticator Management (July 2025); 129 pages.</w:t>
+      </w:r>
+    </w:p>
+    <w:p>
+      <w:pPr>
+        <w:spacing w:after="60"/>
+      </w:pPr>
+      <w:r>
+        <w:rPr>
+          <w:b/>
+        </w:rPr>
+        <w:t xml:space="preserve">Corpus: </w:t>
+      </w:r>
+      <w:r>
+        <w:t>307 chunks, with 180 words per chunk and 40-word overlap.</w:t>
+      </w:r>
+    </w:p>
+    <w:p>
+      <w:pPr>
+        <w:spacing w:after="60"/>
+      </w:pPr>
+      <w:r>
+        <w:rPr>
+          <w:b/>
+        </w:rPr>
+        <w:t xml:space="preserve">Generator: </w:t>
+      </w:r>
+      <w:r>
+        <w:t>Gemini 3.5 Flash-Lite via the Gemini API, used for both baseline and reranked answers.</w:t>
+      </w:r>
+    </w:p>
+    <w:p>
+      <w:pPr>
+        <w:spacing w:after="60"/>
+      </w:pPr>
+      <w:r>
+        <w:rPr>
+          <w:b/>
+        </w:rPr>
+        <w:t xml:space="preserve">Retrieval models: </w:t>
+      </w:r>
+      <w:r>
+        <w:t>sentence-transformers/all-MiniLM-L6-v2 bi-encoder; cross-encoder/ms-marco-MiniLM-L-6-v2 cross-encoder.</w:t>
+      </w:r>
+    </w:p>
+    <w:p>
+      <w:pPr>
+        <w:spacing w:after="0"/>
+      </w:pPr>
+      <w:r>
+        <w:rPr>
+          <w:b/>
+        </w:rPr>
+        <w:t xml:space="preserve">Notebook: </w:t>
+      </w:r>
+      <w:hyperlink r:id="rId9">
+        <w:r>
+          <w:rPr>
+            <w:color w:val="087E8B"/>
+            <w:u w:val="single"/>
+          </w:rPr>
+          <w:t>Open the Jupyter notebook on GitHub</w:t>
+        </w:r>
+      </w:hyperlink>
+      <w:r>
+        <w:t xml:space="preserve">  |  NIST source: https://doi.org/10.6028/NIST.SP.800-63B-4</w:t>
       </w:r>
     </w:p>
     <w:p>
@@ -470,6 +557,11 @@
       </w:tr>
     </w:tbl>
     <w:p>
+      <w:r>
+        <w:br w:type="page"/>
+      </w:r>
+    </w:p>
+    <w:p>
       <w:pPr>
         <w:pStyle w:val="Heading2"/>
       </w:pPr>
@@ -489,11 +581,6 @@
       </w:r>
       <w:r>
         <w:t>Both baseline answers omitted the essential rule by abstaining; neither hallucinated in this run. For F1, the query says “PIN,” while the standard states the rule using “activation secret” and “failed activation attempts.” The dense Top 3 missed that passage. For F2, the explicit negative constraint on voice comparison was buried below broad biometric discussion. Reranking surfaced each exact clause and the LLM recovered the limit and prohibition.</w:t>
-      </w:r>
-    </w:p>
-    <w:p>
-      <w:r>
-        <w:br w:type="page"/>
       </w:r>
     </w:p>
     <w:p>
@@ -926,93 +1013,6 @@
         <w:t>A cross-encoder must run joint attention separately for every query-passage pair. Scoring all 307 chunks would require 307 pairwise inferences per query, about 31 times the ten-passage reranking stage used here. The bi-encoder precomputes passage vectors and cheaply narrows the collection first; the cross-encoder then spends its higher per-pair cost on the strongest candidates, where finer token-level comparison can correct ranking errors.</w:t>
       </w:r>
     </w:p>
-    <w:p>
-      <w:pPr>
-        <w:pStyle w:val="Heading1"/>
-      </w:pPr>
-      <w:r>
-        <w:t>Experiment environment</w:t>
-      </w:r>
-    </w:p>
-    <w:p>
-      <w:pPr>
-        <w:spacing w:after="60"/>
-      </w:pPr>
-      <w:r>
-        <w:rPr>
-          <w:b/>
-        </w:rPr>
-        <w:t xml:space="preserve">Document: </w:t>
-      </w:r>
-      <w:r>
-        <w:t>NIST SP 800-63B-4, Digital Identity Guidelines: Authentication and Authenticator Management (July 2025); 129 pages.</w:t>
-      </w:r>
-    </w:p>
-    <w:p>
-      <w:pPr>
-        <w:spacing w:after="60"/>
-      </w:pPr>
-      <w:r>
-        <w:rPr>
-          <w:b/>
-        </w:rPr>
-        <w:t xml:space="preserve">Corpus: </w:t>
-      </w:r>
-      <w:r>
-        <w:t>307 chunks, with 180 words per chunk and 40-word overlap.</w:t>
-      </w:r>
-    </w:p>
-    <w:p>
-      <w:pPr>
-        <w:spacing w:after="60"/>
-      </w:pPr>
-      <w:r>
-        <w:rPr>
-          <w:b/>
-        </w:rPr>
-        <w:t xml:space="preserve">Generator: </w:t>
-      </w:r>
-      <w:r>
-        <w:t>Gemini 3.5 Flash-Lite via the Gemini API, used for both baseline and reranked answers.</w:t>
-      </w:r>
-    </w:p>
-    <w:p>
-      <w:pPr>
-        <w:spacing w:after="60"/>
-      </w:pPr>
-      <w:r>
-        <w:rPr>
-          <w:b/>
-        </w:rPr>
-        <w:t xml:space="preserve">Retrieval models: </w:t>
-      </w:r>
-      <w:r>
-        <w:t>sentence-transformers/all-MiniLM-L6-v2 bi-encoder; cross-encoder/ms-marco-MiniLM-L-6-v2 cross-encoder.</w:t>
-      </w:r>
-    </w:p>
-    <w:p>
-      <w:pPr>
-        <w:spacing w:after="0"/>
-      </w:pPr>
-      <w:r>
-        <w:rPr>
-          <w:b/>
-        </w:rPr>
-        <w:t xml:space="preserve">Notebook: </w:t>
-      </w:r>
-      <w:hyperlink r:id="rId9">
-        <w:r>
-          <w:rPr>
-            <w:color w:val="087E8B"/>
-            <w:u w:val="single"/>
-          </w:rPr>
-          <w:t>Open the Jupyter notebook on GitHub</w:t>
-        </w:r>
-      </w:hyperlink>
-      <w:r>
-        <w:t xml:space="preserve">  |  NIST source: https://doi.org/10.6028/NIST.SP.800-63B-4</w:t>
-      </w:r>
-    </w:p>
     <w:sectPr>
       <w:pgSz w:w="12240" w:h="15840"/>
       <w:pgMar w:top="1037" w:right="1123" w:bottom="1037" w:left="1123" w:header="720" w:footer="720" w:gutter="0"/>

</xml_diff>

<commit_message>
Clarify interpretation and distractors in report
</commit_message>
<xml_diff>
--- a/report/RAG_Retrieval_Reranking_Report.docx
+++ b/report/RAG_Retrieval_Reranking_Report.docx
@@ -22,11 +22,6 @@
           <w:sz w:val="20"/>
         </w:rPr>
         <w:t>NIST SP 800-63B-4  |  Failure analysis, answer quality, and latency</w:t>
-      </w:r>
-    </w:p>
-    <w:p>
-      <w:r>
-        <w:t>A bi-encoder quickly retrieves candidate passages, while a cross-encoder reranks the strongest candidates. In two document-specific stress cases, reranking moved the answer-bearing chunk to rank 1 and enabled Gemini Flash-Lite to answer where the baseline abstained.</w:t>
       </w:r>
     </w:p>
     <w:p>
@@ -143,7 +138,7 @@
         <w:t xml:space="preserve">Cross-Encoder. </w:t>
       </w:r>
       <w:r>
-        <w:t>The query and a passage are processed together, so self-attention can compare their tokens directly. This produces a more query-specific relevance score, but requires a separate inference for each query-passage pair.</w:t>
+        <w:t>The query and a passage are processed together, so self-attention can compare their tokens directly. This produces a more query-specific relevance score, but requires a separate inference for each query-passage pair. In the two-stage pipeline, the bi-encoder narrows the search first and the cross-encoder refines the top candidates.</w:t>
       </w:r>
     </w:p>
     <w:p>
@@ -566,7 +561,7 @@
         <w:pStyle w:val="Heading2"/>
       </w:pPr>
       <w:r>
-        <w:t>What the rank shifts show</w:t>
+        <w:t>Interpretation of answer changes</w:t>
       </w:r>
     </w:p>
     <w:p>
@@ -574,13 +569,7 @@
         <w:spacing w:before="100"/>
       </w:pPr>
       <w:r>
-        <w:rPr>
-          <w:b/>
-        </w:rPr>
-        <w:t xml:space="preserve">Interpretation. </w:t>
-      </w:r>
-      <w:r>
-        <w:t>Both baseline answers omitted the essential rule by abstaining; neither hallucinated in this run. For F1, the query says “PIN,” while the standard states the rule using “activation secret” and “failed activation attempts.” The dense Top 3 missed that passage. For F2, the explicit negative constraint on voice comparison was buried below broad biometric discussion. Reranking surfaced each exact clause and the LLM recovered the limit and prohibition.</w:t>
+        <w:t>For both queries, the dense Top 3 lacked the gold passage, so Gemini Answer 1 returned “Insufficient context.” It abstained rather than hallucinating. Reranking moved C0129 and C0113 to rank 1; with those passages available, Gemini Answer 2 stated the 10-attempt activation-secret limit and the voice-biometric prohibition. The generator stayed the same; the retrieved evidence changed. F1 is a terminology trap because the question says “local PIN” and the rule describes a numeric activation secret and failed activation attempts. F2 tests whether the system preserves the explicit negative wording “SHALL NOT.”</w:t>
       </w:r>
     </w:p>
     <w:p>
@@ -588,7 +577,7 @@
         <w:pStyle w:val="Heading2"/>
       </w:pPr>
       <w:r>
-        <w:t>Retrieved distractors</w:t>
+        <w:t>Retrieved distractors and why they matter</w:t>
       </w:r>
     </w:p>
     <w:p>
@@ -596,7 +585,7 @@
         <w:spacing w:after="60"/>
       </w:pPr>
       <w:r>
-        <w:t>F1’s dense Top 3 contained C0249 (local verification and passwords), C0090 (a 64-bit OTP condition), and C0106 (the general 100-attempt throttling rule); the specific 10-attempt activation-secret limit is in C0129. F2’s Top 3 contained general biometric rationale, usability, and measurement passages (C0110, C0225, C0109); the explicit voice SHALL NOT clause is in C0113.</w:t>
+        <w:t>These are the actual passages in the bi-encoder Top 3, not passages added to create the failure. Reporting them shows what the baseline could use and why topical overlap was misleading. F1 retrieved C0249 (local verification and passwords), C0090 (a 64-bit OTP condition), and C0106 (the general 100-attempt throttle); none states the specific 10-attempt activation-secret limit in C0129. F2 retrieved broad biometric rationale, usability, and measurement passages (C0110, C0225, C0109), while the explicit voice SHALL NOT rule was at rank 4 in C0113. Comparing these distractors with the reranked Top 3 makes the retrieval failure and correction auditable.</w:t>
       </w:r>
     </w:p>
     <w:p>

</xml_diff>

<commit_message>
Present answer analysis and distractors as bullets
</commit_message>
<xml_diff>
--- a/report/RAG_Retrieval_Reranking_Report.docx
+++ b/report/RAG_Retrieval_Reranking_Report.docx
@@ -566,10 +566,58 @@
     </w:p>
     <w:p>
       <w:pPr>
-        <w:spacing w:before="100"/>
+        <w:pStyle w:val="ListBullet"/>
       </w:pPr>
       <w:r>
-        <w:t>For both queries, the dense Top 3 lacked the gold passage, so Gemini Answer 1 returned “Insufficient context.” It abstained rather than hallucinating. Reranking moved C0129 and C0113 to rank 1; with those passages available, Gemini Answer 2 stated the 10-attempt activation-secret limit and the voice-biometric prohibition. The generator stayed the same; the retrieved evidence changed. F1 is a terminology trap because the question says “local PIN” and the rule describes a numeric activation secret and failed activation attempts. F2 tests whether the system preserves the explicit negative wording “SHALL NOT.”</w:t>
+        <w:rPr>
+          <w:b/>
+        </w:rPr>
+        <w:t xml:space="preserve">Baseline: </w:t>
+      </w:r>
+      <w:r>
+        <w:t>Dense Top 3 missed the gold passage for both queries. Answer 1 returned “Insufficient context,” abstaining rather than hallucinating.</w:t>
+      </w:r>
+    </w:p>
+    <w:p>
+      <w:pPr>
+        <w:pStyle w:val="ListBullet"/>
+      </w:pPr>
+      <w:r>
+        <w:rPr>
+          <w:b/>
+        </w:rPr>
+        <w:t xml:space="preserve">After reranking: </w:t>
+      </w:r>
+      <w:r>
+        <w:t>C0129 (#7 → #1) and C0113 (#4 → #1) moved to rank 1. Answer 2 then stated the 10-attempt activation-secret limit and voice-biometric prohibition. The generator stayed the same; the retrieved evidence changed.</w:t>
+      </w:r>
+    </w:p>
+    <w:p>
+      <w:pPr>
+        <w:pStyle w:val="ListBullet"/>
+      </w:pPr>
+      <w:r>
+        <w:rPr>
+          <w:b/>
+        </w:rPr>
+        <w:t xml:space="preserve">F1 — terminology trap: </w:t>
+      </w:r>
+      <w:r>
+        <w:t>The query says “local PIN”; NIST describes the rule as a numeric activation secret and failed activation attempts.</w:t>
+      </w:r>
+    </w:p>
+    <w:p>
+      <w:pPr>
+        <w:pStyle w:val="ListBullet"/>
+      </w:pPr>
+      <w:r>
+        <w:rPr>
+          <w:b/>
+        </w:rPr>
+        <w:t xml:space="preserve">F2 — negation: </w:t>
+      </w:r>
+      <w:r>
+        <w:t>The answer must preserve the explicit “SHALL NOT” prohibition on voice-biometric comparison.</w:t>
       </w:r>
     </w:p>
     <w:p>
@@ -582,10 +630,45 @@
     </w:p>
     <w:p>
       <w:pPr>
+        <w:pStyle w:val="ListBullet"/>
+      </w:pPr>
+      <w:r>
+        <w:rPr>
+          <w:b/>
+        </w:rPr>
+        <w:t xml:space="preserve">F1: </w:t>
+      </w:r>
+      <w:r>
+        <w:t>The baseline retrieved C0249 (local verification and passwords), C0090 (a 64-bit OTP condition), and C0106 (the general 100-attempt throttle). None states C0129’s specific 10-attempt activation-secret limit.</w:t>
+      </w:r>
+    </w:p>
+    <w:p>
+      <w:pPr>
+        <w:pStyle w:val="ListBullet"/>
+      </w:pPr>
+      <w:r>
+        <w:rPr>
+          <w:b/>
+        </w:rPr>
+        <w:t xml:space="preserve">F2: </w:t>
+      </w:r>
+      <w:r>
+        <w:t>The baseline retrieved broad biometric rationale, usability, and measurement passages (C0110, C0225, C0109). The explicit voice “SHALL NOT” rule in C0113 was at rank 4.</w:t>
+      </w:r>
+    </w:p>
+    <w:p>
+      <w:pPr>
+        <w:pStyle w:val="ListBullet"/>
         <w:spacing w:after="60"/>
       </w:pPr>
       <w:r>
-        <w:t>These are the actual passages in the bi-encoder Top 3, not passages added to create the failure. Reporting them shows what the baseline could use and why topical overlap was misleading. F1 retrieved C0249 (local verification and passwords), C0090 (a 64-bit OTP condition), and C0106 (the general 100-attempt throttle); none states the specific 10-attempt activation-secret limit in C0129. F2 retrieved broad biometric rationale, usability, and measurement passages (C0110, C0225, C0109), while the explicit voice SHALL NOT rule was at rank 4 in C0113. Comparing these distractors with the reranked Top 3 makes the retrieval failure and correction auditable.</w:t>
+        <w:rPr>
+          <w:b/>
+        </w:rPr>
+        <w:t xml:space="preserve">Why include them: </w:t>
+      </w:r>
+      <w:r>
+        <w:t>These are the actual dense Top 3 results, not added examples. Comparing them with the reranked Top 3 shows what evidence Answer 1 saw and makes the retrieval miss and correction auditable.</w:t>
       </w:r>
     </w:p>
     <w:p>

</xml_diff>

<commit_message>
Simplify interpretation bullet labels
</commit_message>
<xml_diff>
--- a/report/RAG_Retrieval_Reranking_Report.docx
+++ b/report/RAG_Retrieval_Reranking_Report.docx
@@ -600,7 +600,7 @@
         <w:rPr>
           <w:b/>
         </w:rPr>
-        <w:t xml:space="preserve">F1 — terminology trap: </w:t>
+        <w:t xml:space="preserve">Terminology trap: </w:t>
       </w:r>
       <w:r>
         <w:t>The query says “local PIN”; NIST describes the rule as a numeric activation secret and failed activation attempts.</w:t>
@@ -614,7 +614,7 @@
         <w:rPr>
           <w:b/>
         </w:rPr>
-        <w:t xml:space="preserve">F2 — negation: </w:t>
+        <w:t xml:space="preserve">Negation: </w:t>
       </w:r>
       <w:r>
         <w:t>The answer must preserve the explicit “SHALL NOT” prohibition on voice-biometric comparison.</w:t>

</xml_diff>